<commit_message>
Bộ cấp 1–2: hoàn thiện hồ sơ BVDLCN (20 DPIA, 21 thông báo vi phạm), xuất Word 17–23, cập nhật danh mục và bản tiếng Anh
Co-Authored-By: Claude Opus 5.5 <noreply@anthropic.com>
Claude-Session: https://claude.ai/code/session_01EYfrLZFALxho7iwpK7bTVa
</commit_message>
<xml_diff>
--- a/templates/08-bo-mau-cap-1-2/01-phieu-sang-loc-cap-do.docx
+++ b/templates/08-bo-mau-cap-1-2/01-phieu-sang-loc-cap-do.docx
@@ -1584,7 +1584,7 @@
                 <w:szCs w:val="24"/>
                 <w:highlight w:val="yellow"/>
               </w:rPr>
-              <w:t xml:space="preserve">Nhân viên Công ty, khoảng 120 tài khoản; không có người dùng bên ngoài</w:t>
+              <w:t xml:space="preserve">Nhân viên, cộng tác viên của Công ty, khoảng 40 tài khoản; không có người dùng bên ngoài</w:t>
             </w:r>
           </w:p>
         </w:tc>
@@ -1820,7 +1820,7 @@
                 <w:szCs w:val="24"/>
                 <w:highlight w:val="yellow"/>
               </w:rPr>
-              <w:t xml:space="preserve">DLCN cơ bản: khoảng 120 chủ thể (nhân viên); DLCN nhạy cảm: 0 (chốt ngày 05/10/2026)</w:t>
+              <w:t xml:space="preserve">DLCN cơ bản: khoảng 40 chủ thể (nhân viên, cộng tác viên); DLCN nhạy cảm (ảnh thẻ căn cước, giấy khám sức khỏe — lưu trong hồ sơ nhân sự): dưới 40 chủ thể (chốt ngày 05/10/2026)</w:t>
             </w:r>
           </w:p>
         </w:tc>

</xml_diff>